<commit_message>
docs: archive v0.7.0 Word documents
</commit_message>
<xml_diff>
--- a/user-docs/DeepSeek-Agent-V3-工作日志-0.7.1.docx
+++ b/user-docs/DeepSeek-Agent-V3-工作日志-0.7.1.docx
@@ -793,7 +793,84 @@
         <w:rPr>
           <w:rFonts w:hint="eastAsia"/>
         </w:rPr>
-        <w:t xml:space="preserve">旧版</w:t>
+        <w:t xml:space="preserve">正式发布提交：</w:t>
+      </w:r>
+      <w:r>
+        <w:rPr>
+          <w:rStyle w:val="VerbatimChar"/>
+        </w:rPr>
+        <w:t xml:space="preserve">94b6bab</w:t>
+      </w:r>
+      <w:r>
+        <w:rPr>
+          <w:rFonts w:hint="eastAsia"/>
+        </w:rPr>
+        <w:t xml:space="preserve">（</w:t>
+      </w:r>
+      <w:r>
+        <w:rPr>
+          <w:rStyle w:val="VerbatimChar"/>
+        </w:rPr>
+        <w:t xml:space="preserve">fix: Deep Agent v0.7.1 interactive input</w:t>
+      </w:r>
+      <w:r>
+        <w:rPr>
+          <w:rFonts w:hint="eastAsia"/>
+        </w:rPr>
+        <w:t xml:space="preserve">）。GitHub</w:t>
+      </w:r>
+      <w:r>
+        <w:t xml:space="preserve"> </w:t>
+      </w:r>
+      <w:r>
+        <w:rPr>
+          <w:rStyle w:val="VerbatimChar"/>
+        </w:rPr>
+        <w:t xml:space="preserve">main</w:t>
+      </w:r>
+      <w:r>
+        <w:t xml:space="preserve"> </w:t>
+      </w:r>
+      <w:r>
+        <w:rPr>
+          <w:rFonts w:hint="eastAsia"/>
+        </w:rPr>
+        <w:t xml:space="preserve">已推送，</w:t>
+      </w:r>
+      <w:r>
+        <w:rPr>
+          <w:rStyle w:val="VerbatimChar"/>
+        </w:rPr>
+        <w:t xml:space="preserve">v0.7.1</w:t>
+      </w:r>
+      <w:r>
+        <w:t xml:space="preserve"> </w:t>
+      </w:r>
+      <w:r>
+        <w:rPr>
+          <w:rFonts w:hint="eastAsia"/>
+        </w:rPr>
+        <w:t xml:space="preserve">注释标签指向该提交。</w:t>
+      </w:r>
+    </w:p>
+    <w:p>
+      <w:pPr>
+        <w:pStyle w:val="BodyText"/>
+      </w:pPr>
+      <w:r>
+        <w:rPr>
+          <w:rFonts w:hint="eastAsia"/>
+        </w:rPr>
+        <w:t xml:space="preserve">用户关闭</w:t>
+      </w:r>
+      <w:r>
+        <w:t xml:space="preserve"> Word </w:t>
+      </w:r>
+      <w:r>
+        <w:rPr>
+          <w:rFonts w:hint="eastAsia"/>
+        </w:rPr>
+        <w:t xml:space="preserve">后，已将旧版</w:t>
       </w:r>
       <w:r>
         <w:t xml:space="preserve"> </w:t>
@@ -808,61 +885,63 @@
         <w:t xml:space="preserve"> </w:t>
       </w:r>
       <w:r>
+        <w:rPr>
+          <w:rFonts w:hint="eastAsia"/>
+        </w:rPr>
+        <w:t xml:space="preserve">使用说明归档到</w:t>
+      </w:r>
+      <w:r>
+        <w:t xml:space="preserve"> </w:t>
+      </w:r>
+      <w:r>
+        <w:rPr>
+          <w:rStyle w:val="VerbatimChar"/>
+          <w:rFonts w:hint="eastAsia"/>
+        </w:rPr>
+        <w:t xml:space="preserve">老版使用说明/</w:t>
+      </w:r>
+      <w:r>
+        <w:rPr>
+          <w:rFonts w:hint="eastAsia"/>
+        </w:rPr>
+        <w:t xml:space="preserve">，工作日志归档到</w:t>
+      </w:r>
+      <w:r>
+        <w:t xml:space="preserve"> </w:t>
+      </w:r>
+      <w:r>
+        <w:rPr>
+          <w:rStyle w:val="VerbatimChar"/>
+          <w:rFonts w:hint="eastAsia"/>
+        </w:rPr>
+        <w:t xml:space="preserve">老版工作日志/</w:t>
+      </w:r>
+      <w:r>
+        <w:rPr>
+          <w:rFonts w:hint="eastAsia"/>
+        </w:rPr>
+        <w:t xml:space="preserve">。新版</w:t>
+      </w:r>
+      <w:r>
+        <w:t xml:space="preserve"> </w:t>
+      </w:r>
+      <w:r>
+        <w:rPr>
+          <w:rStyle w:val="VerbatimChar"/>
+        </w:rPr>
+        <w:t xml:space="preserve">0.7.1</w:t>
+      </w:r>
+      <w:r>
+        <w:t xml:space="preserve"> </w:t>
+      </w:r>
+      <w:r>
         <w:t xml:space="preserve">Word </w:t>
       </w:r>
       <w:r>
         <w:rPr>
           <w:rFonts w:hint="eastAsia"/>
         </w:rPr>
-        <w:t xml:space="preserve">文档在生成时仍被</w:t>
-      </w:r>
-      <w:r>
-        <w:t xml:space="preserve"> Windows/Word </w:t>
-      </w:r>
-      <w:r>
-        <w:rPr>
-          <w:rFonts w:hint="eastAsia"/>
-        </w:rPr>
-        <w:t xml:space="preserve">打开，检测到</w:t>
-      </w:r>
-      <w:r>
-        <w:t xml:space="preserve"> </w:t>
-      </w:r>
-      <w:r>
-        <w:rPr>
-          <w:rStyle w:val="VerbatimChar"/>
-        </w:rPr>
-        <w:t xml:space="preserve">~$</w:t>
-      </w:r>
-      <w:r>
-        <w:t xml:space="preserve"> </w:t>
-      </w:r>
-      <w:r>
-        <w:rPr>
-          <w:rFonts w:hint="eastAsia"/>
-        </w:rPr>
-        <w:t xml:space="preserve">锁定文件，因此未强制移动。新版</w:t>
-      </w:r>
-      <w:r>
-        <w:t xml:space="preserve"> </w:t>
-      </w:r>
-      <w:r>
-        <w:rPr>
-          <w:rStyle w:val="VerbatimChar"/>
-        </w:rPr>
-        <w:t xml:space="preserve">0.7.1</w:t>
-      </w:r>
-      <w:r>
-        <w:t xml:space="preserve"> </w:t>
-      </w:r>
-      <w:r>
-        <w:t xml:space="preserve">Word </w:t>
-      </w:r>
-      <w:r>
-        <w:rPr>
-          <w:rFonts w:hint="eastAsia"/>
-        </w:rPr>
-        <w:t xml:space="preserve">已生成；关闭占用文档后可安全移入对应的老版目录。</w:t>
+        <w:t xml:space="preserve">文档保留在当前目录，作为唯一的当前版本说明。</w:t>
       </w:r>
     </w:p>
     <w:bookmarkEnd w:id="15"/>

</xml_diff>